<commit_message>
Add English robot workbench with model and tool import and embedded monitors
</commit_message>
<xml_diff>
--- a/docs/google_docs_copy.docx
+++ b/docs/google_docs_copy.docx
@@ -1177,6 +1177,38 @@
       </w:pPr>
       <w:r>
         <w:t xml:space="preserve">随后按 M1～M5 推进：M1 接入 llm_ros 和 sam3_ros，校验指令与分割结果；M2 对齐 RGB-D、恢复三维并标定相机到基座；M3 生成抓取候选，检查 TCP、IK、关节和碰撞约束；M4 用状态机串行执行接近、夹持、搬运与释放，并验证物理结果；M5 固定场景评估成功率、误差、延迟和失败原因。每阶段保存输入、配置、日志及结果，上一阶段验收后再接入下一阶段。</w:t>
+      </w:r>
+    </w:p>
+    <w:p>
+      <w:pPr>
+        <w:pStyle w:val="Normal"/>
+      </w:pPr>
+      <w:r>
+        <w:t xml:space="preserve"/>
+      </w:r>
+    </w:p>
+    <w:p>
+      <w:pPr>
+        <w:pStyle w:val="Heading1"/>
+      </w:pPr>
+      <w:r>
+        <w:t xml:space="preserve">9. 全英文桌面 UI</w:t>
+      </w:r>
+    </w:p>
+    <w:p>
+      <w:pPr>
+        <w:pStyle w:val="Normal"/>
+      </w:pPr>
+      <w:r>
+        <w:t xml:space="preserve"/>
+      </w:r>
+    </w:p>
+    <w:p>
+      <w:pPr>
+        <w:pStyle w:val="Normal"/>
+      </w:pPr>
+      <w:r>
+        <w:t xml:space="preserve">使用 ./scripts/run_workbench.sh --start 启动 Robot Workbench。左侧导入机器人 URDF 和末端 URDF/STL/OBJ，选择安装连杆，配置安装位置、角度、缩放及 TCP；Apply &amp; Reload 更新自己启动的仿真。中心显示真实仿真画面，下方提供关节/TCP 控制和 Robot Monitor。可以保存及重新打开 JSON 项目。View → Legacy Robot Monitor 可选择原有监控器与工作区，把实际 Qt6 窗口嵌入子模块。七轴兼容模型提供轨迹控制，其他轴数明确显示 Preview Only。末端以刚性器械装配，固定夹爪示例不含手指驱动。</w:t>
       </w:r>
     </w:p>
     <w:sectPr>

</xml_diff>

<commit_message>
Translate project guides and student documentation into English
</commit_message>
<xml_diff>
--- a/docs/google_docs_copy.docx
+++ b/docs/google_docs_copy.docx
@@ -7,7 +7,7 @@
         <w:pStyle w:val="Title"/>
       </w:pPr>
       <w:r>
-        <w:t xml:space="preserve">LBR Stack × PyBullet 独立运控项目与学生实施说明</w:t>
+        <w:t xml:space="preserve">PyBullet Motion Control and Student Implementation Guide</w:t>
       </w:r>
     </w:p>
     <w:p>
@@ -23,39 +23,47 @@
         <w:pStyle w:val="Heading1"/>
       </w:pPr>
       <w:r>
-        <w:t xml:space="preserve">1. 项目目标</w:t>
-      </w:r>
-    </w:p>
-    <w:p>
-      <w:pPr>
-        <w:pStyle w:val="Normal"/>
-      </w:pPr>
-      <w:r>
-        <w:t xml:space="preserve"/>
-      </w:r>
-    </w:p>
-    <w:p>
-      <w:pPr>
-        <w:pStyle w:val="Normal"/>
-      </w:pPr>
-      <w:r>
-        <w:t xml:space="preserve">建立可独立构建、调试和可视化运行的 ROS 2 运控仓库 lbr_pybullet_ros。其他节点发送关节位置、末端位姿或笛卡尔路径，本模块负责转换、执行并反馈结果，作为 llm_ros、sam3_ros 与后续器械分拣任务之间的运动执行层。</w:t>
-      </w:r>
-    </w:p>
-    <w:p>
-      <w:pPr>
-        <w:pStyle w:val="Normal"/>
-      </w:pPr>
-      <w:r>
-        <w:t xml:space="preserve"/>
-      </w:r>
-    </w:p>
-    <w:p>
-      <w:pPr>
-        <w:pStyle w:val="Normal"/>
-      </w:pPr>
-      <w:r>
-        <w:t xml:space="preserve">本地仓库：/home/siqin/ros2_workspaces/lbr_pybullet_ros。仓库名称独立，ROS 包名保留 lbr_pybullet_control、lbr_pybullet_tutorial，接口保留 /lbr_tutorial，方便与原教程兼容。GitHub 独立仓库：https://github.com/jackysqing-max/robot-visual-simulation-platform 。本地源码仓库及压缩包继续保留。</w:t>
+        <w:t xml:space="preserve">1. Project objective</w:t>
+      </w:r>
+    </w:p>
+    <w:p>
+      <w:pPr>
+        <w:pStyle w:val="Normal"/>
+      </w:pPr>
+      <w:r>
+        <w:t xml:space="preserve"/>
+      </w:r>
+    </w:p>
+    <w:p>
+      <w:pPr>
+        <w:pStyle w:val="Normal"/>
+      </w:pPr>
+      <w:r>
+        <w:t xml:space="preserve">Build, debug, and visualize a self-contained ROS 2 motion-control project. Other nodes send joint positions, end-effector poses, or Cartesian paths; this module converts and executes them and reports results. It provides the motion layer for llm_ros, sam3_ros, and later medical instrument sorting tasks.</w:t>
+      </w:r>
+    </w:p>
+    <w:p>
+      <w:pPr>
+        <w:pStyle w:val="Normal"/>
+      </w:pPr>
+      <w:r>
+        <w:t xml:space="preserve"/>
+      </w:r>
+    </w:p>
+    <w:p>
+      <w:pPr>
+        <w:pStyle w:val="Normal"/>
+      </w:pPr>
+      <w:r>
+        <w:t xml:space="preserve">Repository: https://github.com/jackysqing-max/robot-visual-simulation-platform</w:t>
+      </w:r>
+    </w:p>
+    <w:p>
+      <w:pPr>
+        <w:pStyle w:val="Normal"/>
+      </w:pPr>
+      <w:r>
+        <w:t xml:space="preserve">The ROS packages remain lbr_pybullet_control and lbr_pybullet_tutorial, with /lbr_tutorial interfaces retained for tutorial compatibility. The standalone motion core can run without the desktop workbench.</w:t>
       </w:r>
     </w:p>
     <w:p>
@@ -71,55 +79,55 @@
         <w:pStyle w:val="Heading1"/>
       </w:pPr>
       <w:r>
-        <w:t xml:space="preserve">2. 实际控制链路</w:t>
-      </w:r>
-    </w:p>
-    <w:p>
-      <w:pPr>
-        <w:pStyle w:val="Normal"/>
-      </w:pPr>
-      <w:r>
-        <w:t xml:space="preserve"/>
-      </w:r>
-    </w:p>
-    <w:p>
-      <w:pPr>
-        <w:pStyle w:val="Normal"/>
-      </w:pPr>
-      <w:r>
-        <w:t xml:space="preserve">ROS 2 目标 → 轨迹生成/数值 IK → FollowJointTrajectory → joint_trajectory_controller（JTC）→ ros2_control 硬件插件 → PyBullet 位置伺服与物理步进 → 实测关节反馈。</w:t>
-      </w:r>
-    </w:p>
-    <w:p>
-      <w:pPr>
-        <w:pStyle w:val="Normal"/>
-      </w:pPr>
-      <w:r>
-        <w:t xml:space="preserve"/>
-      </w:r>
-    </w:p>
-    <w:p>
-      <w:pPr>
-        <w:pStyle w:val="Normal"/>
-      </w:pPr>
-      <w:r>
-        <w:t xml:space="preserve">本项目复用 LBR Stack 的控制器配置、标准 action 接口及原始关节轨迹客户端；JTC 来自 ROS 官方 ros2_controllers。末端轨迹的采样、四元数 SLERP 和数值 IK 由本项目实现。关节 demo 提供零端点速度，JTC 采用三次插值；笛卡尔路径转换为仅含位置的关节采样点，JTC 在点间线性插值。物理反馈参与控制器的状态与误差监视。</w:t>
-      </w:r>
-    </w:p>
-    <w:p>
-      <w:pPr>
-        <w:pStyle w:val="Normal"/>
-      </w:pPr>
-      <w:r>
-        <w:t xml:space="preserve"/>
-      </w:r>
-    </w:p>
-    <w:p>
-      <w:pPr>
-        <w:pStyle w:val="Normal"/>
-      </w:pPr>
-      <w:r>
-        <w:t xml:space="preserve">默认模型为 PyBullet 内置七轴 iiwa。末端定义为 link7，没有附加工具 TCP；world 与 lbr_link_0 重合。当前完成机械臂仿真运控，夹爪、避障、抓取结果验证与真机迁移属于后续阶段。</w:t>
+        <w:t xml:space="preserve">2. Control chain</w:t>
+      </w:r>
+    </w:p>
+    <w:p>
+      <w:pPr>
+        <w:pStyle w:val="Normal"/>
+      </w:pPr>
+      <w:r>
+        <w:t xml:space="preserve"/>
+      </w:r>
+    </w:p>
+    <w:p>
+      <w:pPr>
+        <w:pStyle w:val="Normal"/>
+      </w:pPr>
+      <w:r>
+        <w:t xml:space="preserve">ROS 2 goal -&gt; trajectory generation / numerical IK -&gt; FollowJointTrajectory -&gt; joint_trajectory_controller (JTC) -&gt; ros2_control hardware plugin -&gt; PyBullet position servos and physics stepping -&gt; measured joint feedback.</w:t>
+      </w:r>
+    </w:p>
+    <w:p>
+      <w:pPr>
+        <w:pStyle w:val="Normal"/>
+      </w:pPr>
+      <w:r>
+        <w:t xml:space="preserve"/>
+      </w:r>
+    </w:p>
+    <w:p>
+      <w:pPr>
+        <w:pStyle w:val="Normal"/>
+      </w:pPr>
+      <w:r>
+        <w:t xml:space="preserve">The project reuses LBR Stack controller configuration, standard actions, and the original joint trajectory client. JTC is the official ros2_controllers implementation. Cartesian sampling, quaternion SLERP, and numerical IK are implemented here. Joint demos supply zero endpoint velocities for cubic interpolation; Cartesian joint samples contain positions only and use linear JTC interpolation. Physical feedback supports controller state and error monitoring.</w:t>
+      </w:r>
+    </w:p>
+    <w:p>
+      <w:pPr>
+        <w:pStyle w:val="Normal"/>
+      </w:pPr>
+      <w:r>
+        <w:t xml:space="preserve"/>
+      </w:r>
+    </w:p>
+    <w:p>
+      <w:pPr>
+        <w:pStyle w:val="Normal"/>
+      </w:pPr>
+      <w:r>
+        <w:t xml:space="preserve">The default model is PyBullet's seven-axis iiwa. Its end effector is link7, with no additional tool TCP, and world coincides with lbr_link_0. Arm-motion simulation is implemented. Gripper actuation, obstacle avoidance, grasp-result verification, and real-robot migration are later work. Configured workbench projects have explicit tools and TCPs; follow docs/workbench.md for their conventions.</w:t>
       </w:r>
     </w:p>
     <w:p>
@@ -135,88 +143,79 @@
         <w:pStyle w:val="Heading1"/>
       </w:pPr>
       <w:r>
-        <w:t xml:space="preserve">3. 工程组成与安装</w:t>
-      </w:r>
-    </w:p>
-    <w:p>
-      <w:pPr>
-        <w:pStyle w:val="Normal"/>
-      </w:pPr>
-      <w:r>
-        <w:t xml:space="preserve"/>
-      </w:r>
-    </w:p>
-    <w:p>
-      <w:pPr>
-        <w:pStyle w:val="Normal"/>
-      </w:pPr>
-      <w:r>
-        <w:t xml:space="preserve">src/lbr_pybullet_control：C++ SystemInterface，连接 JTC 命令与 PyBullet 实测状态。</w:t>
-      </w:r>
-    </w:p>
-    <w:p>
-      <w:pPr>
-        <w:pStyle w:val="Normal"/>
-      </w:pPr>
-      <w:r>
-        <w:t xml:space="preserve">src/lbr_pybullet_tutorial：仿真、FK/IK、目标接收、demo、launch 与配置。</w:t>
-      </w:r>
-    </w:p>
-    <w:p>
-      <w:pPr>
-        <w:pStyle w:val="Normal"/>
-      </w:pPr>
-      <w:r>
-        <w:t xml:space="preserve">scripts：安装构建、启动、自动检查及轨迹绘图。</w:t>
-      </w:r>
-    </w:p>
-    <w:p>
-      <w:pPr>
-        <w:pStyle w:val="Normal"/>
-      </w:pPr>
-      <w:r>
-        <w:t xml:space="preserve">docs：接口、快速开始、学生计划和验证证据。</w:t>
-      </w:r>
-    </w:p>
-    <w:p>
-      <w:pPr>
-        <w:pStyle w:val="Normal"/>
-      </w:pPr>
-      <w:r>
-        <w:t xml:space="preserve">third_party/lbr_stack：固定版本的上游配置、客户端、来源及许可记录。</w:t>
-      </w:r>
-    </w:p>
-    <w:p>
-      <w:pPr>
-        <w:pStyle w:val="Normal"/>
-      </w:pPr>
-      <w:r>
-        <w:t xml:space="preserve"/>
-      </w:r>
-    </w:p>
-    <w:p>
-      <w:pPr>
-        <w:pStyle w:val="Normal"/>
-      </w:pPr>
-      <w:r>
-        <w:t xml:space="preserve">环境为 Ubuntu 22.04、ROS 2 Humble 与系统 Python 3。新机器先安装 ROS 2 Humble，再执行：</w:t>
-      </w:r>
-    </w:p>
-    <w:p>
-      <w:pPr>
-        <w:pStyle w:val="Normal"/>
-      </w:pPr>
-      <w:r>
-        <w:t xml:space="preserve"/>
-      </w:r>
-    </w:p>
-    <w:p>
-      <w:pPr>
-        <w:pStyle w:val="Code"/>
-        <w:shd w:fill="F3F4F6" w:val="clear"/>
-      </w:pPr>
-      <w:r>
-        <w:t xml:space="preserve">cd /home/siqin/ros2_workspaces/lbr_pybullet_ros</w:t>
+        <w:t xml:space="preserve">3. Components and installation</w:t>
+      </w:r>
+    </w:p>
+    <w:p>
+      <w:pPr>
+        <w:pStyle w:val="Normal"/>
+      </w:pPr>
+      <w:r>
+        <w:t xml:space="preserve"/>
+      </w:r>
+    </w:p>
+    <w:p>
+      <w:pPr>
+        <w:pStyle w:val="Normal"/>
+      </w:pPr>
+      <w:r>
+        <w:t xml:space="preserve">src/lbr_pybullet_control: C++ SystemInterface between JTC commands and measured PyBullet state.</w:t>
+      </w:r>
+    </w:p>
+    <w:p>
+      <w:pPr>
+        <w:pStyle w:val="Normal"/>
+      </w:pPr>
+      <w:r>
+        <w:t xml:space="preserve">src/lbr_pybullet_tutorial: simulation, FK/IK, goal receiver, demos, launches, configuration, and workbench.</w:t>
+      </w:r>
+    </w:p>
+    <w:p>
+      <w:pPr>
+        <w:pStyle w:val="Normal"/>
+      </w:pPr>
+      <w:r>
+        <w:t xml:space="preserve">scripts: setup, build, launch, automated checks, and tracking plots.</w:t>
+      </w:r>
+    </w:p>
+    <w:p>
+      <w:pPr>
+        <w:pStyle w:val="Normal"/>
+      </w:pPr>
+      <w:r>
+        <w:t xml:space="preserve">docs: interfaces, quick start, student plan, and validation evidence.</w:t>
+      </w:r>
+    </w:p>
+    <w:p>
+      <w:pPr>
+        <w:pStyle w:val="Normal"/>
+      </w:pPr>
+      <w:r>
+        <w:t xml:space="preserve">third_party/lbr_stack: pinned upstream configuration/client, provenance, and license.</w:t>
+      </w:r>
+    </w:p>
+    <w:p>
+      <w:pPr>
+        <w:pStyle w:val="Normal"/>
+      </w:pPr>
+      <w:r>
+        <w:t xml:space="preserve"/>
+      </w:r>
+    </w:p>
+    <w:p>
+      <w:pPr>
+        <w:pStyle w:val="Normal"/>
+      </w:pPr>
+      <w:r>
+        <w:t xml:space="preserve">Use Ubuntu 22.04, ROS 2 Humble, and system Python 3. Install ROS 2 Humble first. From the repository root:</w:t>
+      </w:r>
+    </w:p>
+    <w:p>
+      <w:pPr>
+        <w:pStyle w:val="Normal"/>
+      </w:pPr>
+      <w:r>
+        <w:t xml:space="preserve"/>
       </w:r>
     </w:p>
     <w:p>
@@ -277,7 +276,7 @@
         <w:pStyle w:val="Normal"/>
       </w:pPr>
       <w:r>
-        <w:t xml:space="preserve">默认后端全部源码在本仓库，无需旧工作区或完整 LBR Stack/FRI SDK。</w:t>
+        <w:t xml:space="preserve">The default backend is self-contained and requires no legacy workspace or full LBR Stack/FRI SDK. See README.md for desktop UI dependencies.</w:t>
       </w:r>
     </w:p>
     <w:p>
@@ -293,23 +292,23 @@
         <w:pStyle w:val="Heading1"/>
       </w:pPr>
       <w:r>
-        <w:t xml:space="preserve">4. 独立运行与 GUI 调试</w:t>
-      </w:r>
-    </w:p>
-    <w:p>
-      <w:pPr>
-        <w:pStyle w:val="Normal"/>
-      </w:pPr>
-      <w:r>
-        <w:t xml:space="preserve"/>
-      </w:r>
-    </w:p>
-    <w:p>
-      <w:pPr>
-        <w:pStyle w:val="Normal"/>
-      </w:pPr>
-      <w:r>
-        <w:t xml:space="preserve">以下两个 demo 依次运行，每次自动启动系统、执行检查、保存报告并关闭本次启动的系统：</w:t>
+        <w:t xml:space="preserve">4. Standalone demos and GUI debugging</w:t>
+      </w:r>
+    </w:p>
+    <w:p>
+      <w:pPr>
+        <w:pStyle w:val="Normal"/>
+      </w:pPr>
+      <w:r>
+        <w:t xml:space="preserve"/>
+      </w:r>
+    </w:p>
+    <w:p>
+      <w:pPr>
+        <w:pStyle w:val="Normal"/>
+      </w:pPr>
+      <w:r>
+        <w:t xml:space="preserve">Run these sequentially. Each starts its system, executes checks, saves a report, and stops its own launch:</w:t>
       </w:r>
     </w:p>
     <w:p>
@@ -351,23 +350,23 @@
         <w:pStyle w:val="Normal"/>
       </w:pPr>
       <w:r>
-        <w:t xml:space="preserve">gui:=false 使用无窗口模式。GUI 需要可用桌面显示；窗口显示关节运动与绿色实测末端轨迹，可调整视角观察。Cartesian demo 依据当前实测关节的 FK 生成边长 3 cm 的闭合方形，保持姿态。报告保存到 artifacts/*_report.json。</w:t>
-      </w:r>
-    </w:p>
-    <w:p>
-      <w:pPr>
-        <w:pStyle w:val="Normal"/>
-      </w:pPr>
-      <w:r>
-        <w:t xml:space="preserve"/>
-      </w:r>
-    </w:p>
-    <w:p>
-      <w:pPr>
-        <w:pStyle w:val="Normal"/>
-      </w:pPr>
-      <w:r>
-        <w:t xml:space="preserve">持续观察和手动发目标时，终端 A 启动：</w:t>
+        <w:t xml:space="preserve">Use gui:=false for headless operation. GUI mode requires a desktop display and shows robot motion with a green measured end-effector trail. Adjust the view with the mouse. The Cartesian demo generates a closed 3 cm square from FK of the current measured joints and holds orientation. Reports are saved as artifacts/*_report.json.</w:t>
+      </w:r>
+    </w:p>
+    <w:p>
+      <w:pPr>
+        <w:pStyle w:val="Normal"/>
+      </w:pPr>
+      <w:r>
+        <w:t xml:space="preserve"/>
+      </w:r>
+    </w:p>
+    <w:p>
+      <w:pPr>
+        <w:pStyle w:val="Normal"/>
+      </w:pPr>
+      <w:r>
+        <w:t xml:space="preserve">For continuous observation and manual goals, start terminal A:</w:t>
       </w:r>
     </w:p>
     <w:p>
@@ -400,7 +399,7 @@
         <w:pStyle w:val="Normal"/>
       </w:pPr>
       <w:r>
-        <w:t xml:space="preserve">终端 B 进入仓库，执行以下环境设置；后续所有 ros2 命令均使用相同设置：</w:t>
+        <w:t xml:space="preserve">In terminal B, open the repository root and apply the following setup. Use the same setup for subsequent ros2 commands:</w:t>
       </w:r>
     </w:p>
     <w:p>
@@ -469,7 +468,7 @@
         <w:pStyle w:val="Normal"/>
       </w:pPr>
       <w:r>
-        <w:t xml:space="preserve">两项控制器应为 active。另一个已设置环境的终端可运行 ros2 run lbr_pybullet_tutorial demo --mode joint 或 --mode cartesian，并观察 /iiwa7/joint_states 与 /lbr/joint_trajectory_controller/state。</w:t>
+        <w:t xml:space="preserve">Both controllers should be active. Another configured terminal can run ros2 run lbr_pybullet_tutorial demo --mode joint or --mode cartesian, while observing /iiwa7/joint_states and /lbr/joint_trajectory_controller/state.</w:t>
       </w:r>
     </w:p>
     <w:p>
@@ -485,95 +484,95 @@
         <w:pStyle w:val="Heading1"/>
       </w:pPr>
       <w:r>
-        <w:t xml:space="preserve">5. 对外 ROS 2 接口与消息示例</w:t>
-      </w:r>
-    </w:p>
-    <w:p>
-      <w:pPr>
-        <w:pStyle w:val="Normal"/>
-      </w:pPr>
-      <w:r>
-        <w:t xml:space="preserve"/>
-      </w:r>
-    </w:p>
-    <w:p>
-      <w:pPr>
-        <w:pStyle w:val="Normal"/>
-      </w:pPr>
-      <w:r>
-        <w:t xml:space="preserve">/lbr_tutorial/joint_goal：sensor_msgs/msg/JointState，完整七轴位置，单位 rad。</w:t>
-      </w:r>
-    </w:p>
-    <w:p>
-      <w:pPr>
-        <w:pStyle w:val="Normal"/>
-      </w:pPr>
-      <w:r>
-        <w:t xml:space="preserve">/lbr_tutorial/pose_goal：geometry_msgs/msg/PoseStamped，单个 link7 位姿，单位 m。</w:t>
-      </w:r>
-    </w:p>
-    <w:p>
-      <w:pPr>
-        <w:pStyle w:val="Normal"/>
-      </w:pPr>
-      <w:r>
-        <w:t xml:space="preserve">/lbr_tutorial/cartesian_path：nav_msgs/msg/Path，按顺序经过的末端位姿。</w:t>
-      </w:r>
-    </w:p>
-    <w:p>
-      <w:pPr>
-        <w:pStyle w:val="Normal"/>
-      </w:pPr>
-      <w:r>
-        <w:t xml:space="preserve">/lbr_tutorial/status：std_msgs/msg/String，JSON 任务事件与 request_id。</w:t>
-      </w:r>
-    </w:p>
-    <w:p>
-      <w:pPr>
-        <w:pStyle w:val="Normal"/>
-      </w:pPr>
-      <w:r>
-        <w:t xml:space="preserve">/lbr_tutorial/cancel：std_srvs/srv/Trigger，取消当前任务。</w:t>
-      </w:r>
-    </w:p>
-    <w:p>
-      <w:pPr>
-        <w:pStyle w:val="Normal"/>
-      </w:pPr>
-      <w:r>
-        <w:t xml:space="preserve">/lbr/joint_trajectory_controller/follow_joint_trajectory：标准 FollowJointTrajectory action，适合精确指定多点时间。</w:t>
-      </w:r>
-    </w:p>
-    <w:p>
-      <w:pPr>
-        <w:pStyle w:val="Normal"/>
-      </w:pPr>
-      <w:r>
-        <w:t xml:space="preserve">/lbr/joint_states、/lbr/joint_trajectory_controller/state：关节反馈及期望/实际/误差。</w:t>
-      </w:r>
-    </w:p>
-    <w:p>
-      <w:pPr>
-        <w:pStyle w:val="Normal"/>
-      </w:pPr>
-      <w:r>
-        <w:t xml:space="preserve">/lbr/ee_pose：默认仿真发布的 link7 实测位姿。</w:t>
-      </w:r>
-    </w:p>
-    <w:p>
-      <w:pPr>
-        <w:pStyle w:val="Normal"/>
-      </w:pPr>
-      <w:r>
-        <w:t xml:space="preserve"/>
-      </w:r>
-    </w:p>
-    <w:p>
-      <w:pPr>
-        <w:pStyle w:val="Normal"/>
-      </w:pPr>
-      <w:r>
-        <w:t xml:space="preserve">系统 ready 后发送关节目标：</w:t>
+        <w:t xml:space="preserve">5. ROS 2 interfaces and examples</w:t>
+      </w:r>
+    </w:p>
+    <w:p>
+      <w:pPr>
+        <w:pStyle w:val="Normal"/>
+      </w:pPr>
+      <w:r>
+        <w:t xml:space="preserve"/>
+      </w:r>
+    </w:p>
+    <w:p>
+      <w:pPr>
+        <w:pStyle w:val="Normal"/>
+      </w:pPr>
+      <w:r>
+        <w:t xml:space="preserve">/lbr_tutorial/joint_goal: sensor_msgs/msg/JointState; complete seven-joint positions, rad.</w:t>
+      </w:r>
+    </w:p>
+    <w:p>
+      <w:pPr>
+        <w:pStyle w:val="Normal"/>
+      </w:pPr>
+      <w:r>
+        <w:t xml:space="preserve">/lbr_tutorial/pose_goal: geometry_msgs/msg/PoseStamped; one link7 pose for the default model, m.</w:t>
+      </w:r>
+    </w:p>
+    <w:p>
+      <w:pPr>
+        <w:pStyle w:val="Normal"/>
+      </w:pPr>
+      <w:r>
+        <w:t xml:space="preserve">/lbr_tutorial/cartesian_path: nav_msgs/msg/Path; ordered end-effector poses.</w:t>
+      </w:r>
+    </w:p>
+    <w:p>
+      <w:pPr>
+        <w:pStyle w:val="Normal"/>
+      </w:pPr>
+      <w:r>
+        <w:t xml:space="preserve">/lbr_tutorial/status: std_msgs/msg/String; JSON events and request_id.</w:t>
+      </w:r>
+    </w:p>
+    <w:p>
+      <w:pPr>
+        <w:pStyle w:val="Normal"/>
+      </w:pPr>
+      <w:r>
+        <w:t xml:space="preserve">/lbr_tutorial/cancel: std_srvs/srv/Trigger; cancel the active task.</w:t>
+      </w:r>
+    </w:p>
+    <w:p>
+      <w:pPr>
+        <w:pStyle w:val="Normal"/>
+      </w:pPr>
+      <w:r>
+        <w:t xml:space="preserve">/lbr/joint_trajectory_controller/follow_joint_trajectory: standard FollowJointTrajectory action for explicit multi-point timing.</w:t>
+      </w:r>
+    </w:p>
+    <w:p>
+      <w:pPr>
+        <w:pStyle w:val="Normal"/>
+      </w:pPr>
+      <w:r>
+        <w:t xml:space="preserve">/lbr/joint_states and /lbr/joint_trajectory_controller/state: measured joints and desired/actual/error.</w:t>
+      </w:r>
+    </w:p>
+    <w:p>
+      <w:pPr>
+        <w:pStyle w:val="Normal"/>
+      </w:pPr>
+      <w:r>
+        <w:t xml:space="preserve">/lbr/ee_pose: measured link7 pose from the default simulator.</w:t>
+      </w:r>
+    </w:p>
+    <w:p>
+      <w:pPr>
+        <w:pStyle w:val="Normal"/>
+      </w:pPr>
+      <w:r>
+        <w:t xml:space="preserve"/>
+      </w:r>
+    </w:p>
+    <w:p>
+      <w:pPr>
+        <w:pStyle w:val="Normal"/>
+      </w:pPr>
+      <w:r>
+        <w:t xml:space="preserve">After ready, send a joint goal:</w:t>
       </w:r>
     </w:p>
     <w:p>
@@ -615,7 +614,7 @@
         <w:pStyle w:val="Normal"/>
       </w:pPr>
       <w:r>
-        <w:t xml:space="preserve">末端目标必须来自当前模型的 FK 或经验证的规划结果。以下可运行示例读取 /lbr/ee_pose，在当前位姿上沿 y 移动 1 cm；将 mode 改为 path 可发送“移动后返回”的路径。运行前等待上一任务结束：</w:t>
+        <w:t xml:space="preserve">End-effector targets must come from model FK or validated planning. This runnable default-model example reads /lbr/ee_pose and moves 1 cm along y. Set mode to path for a move-and-return path. Wait for the preceding task to finish before running it:</w:t>
       </w:r>
     </w:p>
     <w:p>
@@ -776,7 +775,7 @@
         <w:shd w:fill="F3F4F6" w:val="clear"/>
       </w:pPr>
       <w:r>
-        <w:t xml:space="preserve">mode = 'pose'  # 改为 'path'，运行另一种输入示例</w:t>
+        <w:t xml:space="preserve">mode = 'pose'  # Change to 'path' for the alternative input.</w:t>
       </w:r>
     </w:p>
     <w:p>
@@ -891,7 +890,7 @@
         <w:pStyle w:val="Normal"/>
       </w:pPr>
       <w:r>
-        <w:t xml:space="preserve">位姿 frame 只接受 world 或 lbr_link_0；目标 stamp 必须为零；姿态为归一化 x/y/z/w 四元数。相机坐标与工具 TCP 需要应用层先转换。观察同一 request_id 的最终 succeeded、failed 或 rejected，accepted 仅表示开始提交。忙碌时新目标被拒绝。取消命令：</w:t>
+        <w:t xml:space="preserve">Pose frames must be world or lbr_link_0. Goal timestamps must be zero; quaternions must be normalized in x/y/z/w order. Transform camera-frame targets and tool TCPs at the application layer as required by the selected model. Wait for succeeded, failed, or rejected with the matching request_id; accepted means submission has started. Busy inputs are rejected. Request cancellation with:</w:t>
       </w:r>
     </w:p>
     <w:p>
@@ -924,39 +923,39 @@
         <w:pStyle w:val="Heading1"/>
       </w:pPr>
       <w:r>
-        <w:t xml:space="preserve">6. 与其他节点组合</w:t>
-      </w:r>
-    </w:p>
-    <w:p>
-      <w:pPr>
-        <w:pStyle w:val="Normal"/>
-      </w:pPr>
-      <w:r>
-        <w:t xml:space="preserve"/>
-      </w:r>
-    </w:p>
-    <w:p>
-      <w:pPr>
-        <w:pStyle w:val="Normal"/>
-      </w:pPr>
-      <w:r>
-        <w:t xml:space="preserve">其他模块在同一 ROS_DOMAIN_ID 中直接发布上述目标并订阅状态，无需导入本项目的 Python 源码。应用应串行提交目标、关联运控 request_id、等待最终结果后推进任务；直接使用底层 action 时，可使用 action goal UUID 关联执行结果。</w:t>
-      </w:r>
-    </w:p>
-    <w:p>
-      <w:pPr>
-        <w:pStyle w:val="Normal"/>
-      </w:pPr>
-      <w:r>
-        <w:t xml:space="preserve"/>
-      </w:r>
-    </w:p>
-    <w:p>
-      <w:pPr>
-        <w:pStyle w:val="Normal"/>
-      </w:pPr>
-      <w:r>
-        <w:t xml:space="preserve">也可拆分仿真与控制。先在终端 A 完成相同环境设置并启动仿真：</w:t>
+        <w:t xml:space="preserve">6. Compose with other nodes</w:t>
+      </w:r>
+    </w:p>
+    <w:p>
+      <w:pPr>
+        <w:pStyle w:val="Normal"/>
+      </w:pPr>
+      <w:r>
+        <w:t xml:space="preserve"/>
+      </w:r>
+    </w:p>
+    <w:p>
+      <w:pPr>
+        <w:pStyle w:val="Normal"/>
+      </w:pPr>
+      <w:r>
+        <w:t xml:space="preserve">Other modules in the same ROS_DOMAIN_ID can publish goals and subscribe to status without importing this project's Python source. Submit goals serially, correlate motion request IDs, and advance only after the matching final result. Direct action clients can use action goal UUIDs for correlation.</w:t>
+      </w:r>
+    </w:p>
+    <w:p>
+      <w:pPr>
+        <w:pStyle w:val="Normal"/>
+      </w:pPr>
+      <w:r>
+        <w:t xml:space="preserve"/>
+      </w:r>
+    </w:p>
+    <w:p>
+      <w:pPr>
+        <w:pStyle w:val="Normal"/>
+      </w:pPr>
+      <w:r>
+        <w:t xml:space="preserve">Simulation and control can run separately. In a configured terminal A:</w:t>
       </w:r>
     </w:p>
     <w:p>
@@ -989,7 +988,7 @@
         <w:pStyle w:val="Normal"/>
       </w:pPr>
       <w:r>
-        <w:t xml:space="preserve">终端 B 启动控制器和目标接收节点，连接已经运行的兼容仿真：</w:t>
+        <w:t xml:space="preserve">In terminal B, start controllers and goal reception against the running compatible simulator:</w:t>
       </w:r>
     </w:p>
     <w:p>
@@ -1022,40 +1021,40 @@
         <w:pStyle w:val="Normal"/>
       </w:pPr>
       <w:r>
-        <w:t xml:space="preserve">仿真侧须接收 /iiwa7/joint_desired（Float64MultiArray，七轴 rad），持续发布 /iiwa7/joint_states（JointState，iiwa_joint_1～7，完整 position/velocity 和递增时间戳），使用相同模型与关节映射。每台仿真只运行一个实例，命令仅由一套执行链路写入。</w:t>
-      </w:r>
-    </w:p>
-    <w:p>
-      <w:pPr>
-        <w:pStyle w:val="Normal"/>
-      </w:pPr>
-      <w:r>
-        <w:t xml:space="preserve"/>
-      </w:r>
-    </w:p>
-    <w:p>
-      <w:pPr>
-        <w:pStyle w:val="Normal"/>
-      </w:pPr>
-      <w:r>
-        <w:t xml:space="preserve">兼容原有 PyBullet 工作区时显式设置路径：</w:t>
-      </w:r>
-    </w:p>
-    <w:p>
-      <w:pPr>
-        <w:pStyle w:val="Normal"/>
-      </w:pPr>
-      <w:r>
-        <w:t xml:space="preserve"/>
-      </w:r>
-    </w:p>
-    <w:p>
-      <w:pPr>
-        <w:pStyle w:val="Code"/>
-        <w:shd w:fill="F3F4F6" w:val="clear"/>
-      </w:pPr>
-      <w:r>
-        <w:t xml:space="preserve">export LBR_TUTORIAL_LEGACY_WS=/home/siqin/ros2_workspaces/humble/ros2_pybullet_ws</w:t>
+        <w:t xml:space="preserve">The simulator must receive /iiwa7/joint_desired (Float64MultiArray, seven joints in rad) and continuously publish /iiwa7/joint_states (JointState, iiwa_joint_1 through iiwa_joint_7, complete position/velocity, advancing timestamps). Use the same model and mapping, one simulator per robot, and one command-writing chain.</w:t>
+      </w:r>
+    </w:p>
+    <w:p>
+      <w:pPr>
+        <w:pStyle w:val="Normal"/>
+      </w:pPr>
+      <w:r>
+        <w:t xml:space="preserve"/>
+      </w:r>
+    </w:p>
+    <w:p>
+      <w:pPr>
+        <w:pStyle w:val="Normal"/>
+      </w:pPr>
+      <w:r>
+        <w:t xml:space="preserve">For the legacy PyBullet workspace, specify its actual path:</w:t>
+      </w:r>
+    </w:p>
+    <w:p>
+      <w:pPr>
+        <w:pStyle w:val="Normal"/>
+      </w:pPr>
+      <w:r>
+        <w:t xml:space="preserve"/>
+      </w:r>
+    </w:p>
+    <w:p>
+      <w:pPr>
+        <w:pStyle w:val="Code"/>
+        <w:shd w:fill="F3F4F6" w:val="clear"/>
+      </w:pPr>
+      <w:r>
+        <w:t xml:space="preserve">export LBR_TUTORIAL_LEGACY_WS=/path/to/ros2_pybullet_ws</w:t>
       </w:r>
     </w:p>
     <w:p>
@@ -1080,55 +1079,55 @@
         <w:pStyle w:val="Heading1"/>
       </w:pPr>
       <w:r>
-        <w:t xml:space="preserve">7. 验证与验收</w:t>
-      </w:r>
-    </w:p>
-    <w:p>
-      <w:pPr>
-        <w:pStyle w:val="Normal"/>
-      </w:pPr>
-      <w:r>
-        <w:t xml:space="preserve"/>
-      </w:r>
-    </w:p>
-    <w:p>
-      <w:pPr>
-        <w:pStyle w:val="Normal"/>
-      </w:pPr>
-      <w:r>
-        <w:t xml:space="preserve">独立仓库已完成构建与 54 项单元检查；仅加载系统 ROS 和本仓库安装目录的环境中，PyBullet GUI 的关节与笛卡尔 demo 均通过，并保存真实 OpenGL 窗口截图、控制器日志与误差报告。分离运行仿真和控制节点的 external 模式也通过 8 项检查：两个 demo、单个位姿、重复关节名、不可达位姿、错误坐标系、busy 和取消。</w:t>
-      </w:r>
-    </w:p>
-    <w:p>
-      <w:pPr>
-        <w:pStyle w:val="Normal"/>
-      </w:pPr>
-      <w:r>
-        <w:t xml:space="preserve"/>
-      </w:r>
-    </w:p>
-    <w:p>
-      <w:pPr>
-        <w:pStyle w:val="Normal"/>
-      </w:pPr>
-      <w:r>
-        <w:t xml:space="preserve">源码 ZIP 已在全新目录重新构建并完成端到端检查。新证据保存在 docs/evidence/standalone_gui、standalone_external 与 portability，单元记录为 standalone_unit_tests.txt。GUI 曾有一次跟踪误差超限，失败记录与后续通过记录一并保存。精确指标及测量定义见 docs/validation.md 和对应 JSON。原教程的旧后端、反馈中断及上游客户端记录另行保留，标记为拆分前快照。</w:t>
-      </w:r>
-    </w:p>
-    <w:p>
-      <w:pPr>
-        <w:pStyle w:val="Normal"/>
-      </w:pPr>
-      <w:r>
-        <w:t xml:space="preserve"/>
-      </w:r>
-    </w:p>
-    <w:p>
-      <w:pPr>
-        <w:pStyle w:val="Normal"/>
-      </w:pPr>
-      <w:r>
-        <w:t xml:space="preserve">运行 ./scripts/test.sh 保存新报告。demo 验收包含 action 成功、终点位置误差 &lt;3 mm、终点关节误差 &lt;0.02 rad、终点姿态误差 &lt;0.01 rad、采样最大位置跟踪误差 &lt;15 mm；Cartesian demo 另要求采样路径最大几何偏差 &lt;3 mm。具体测量定义见验证文档。反馈超时会锁定故障，需要重新启动 bringup。</w:t>
+        <w:t xml:space="preserve">7. Validation and acceptance</w:t>
+      </w:r>
+    </w:p>
+    <w:p>
+      <w:pPr>
+        <w:pStyle w:val="Normal"/>
+      </w:pPr>
+      <w:r>
+        <w:t xml:space="preserve"/>
+      </w:r>
+    </w:p>
+    <w:p>
+      <w:pPr>
+        <w:pStyle w:val="Normal"/>
+      </w:pPr>
+      <w:r>
+        <w:t xml:space="preserve">The standalone core was built and passed 54 unit checks in the recorded retest. In an isolated environment sourcing only system ROS and this repository, GUI joint and Cartesian demos passed with real OpenGL captures, logs, and error reports. External mode passed eight checks: both demos, one pose, duplicate-name rejection, unreachable-pose rejection, invalid-frame rejection, busy rejection, and cancellation.</w:t>
+      </w:r>
+    </w:p>
+    <w:p>
+      <w:pPr>
+        <w:pStyle w:val="Normal"/>
+      </w:pPr>
+      <w:r>
+        <w:t xml:space="preserve"/>
+      </w:r>
+    </w:p>
+    <w:p>
+      <w:pPr>
+        <w:pStyle w:val="Normal"/>
+      </w:pPr>
+      <w:r>
+        <w:t xml:space="preserve">The source ZIP was rebuilt and tested end to end in a fresh directory. Evidence is retained under docs/evidence/standalone_gui, standalone_external, and portability, with standalone_unit_tests.txt. An initial GUI tracking-error failure and later passing runs are both preserved. See docs/validation.md and the JSON reports for exact measurements and definitions. Legacy-backend, feedback-interruption, and upstream-client records remain identified as historical snapshots.</w:t>
+      </w:r>
+    </w:p>
+    <w:p>
+      <w:pPr>
+        <w:pStyle w:val="Normal"/>
+      </w:pPr>
+      <w:r>
+        <w:t xml:space="preserve"/>
+      </w:r>
+    </w:p>
+    <w:p>
+      <w:pPr>
+        <w:pStyle w:val="Normal"/>
+      </w:pPr>
+      <w:r>
+        <w:t xml:space="preserve">Run ./scripts/test.sh to create new reports. Demo acceptance requires action success, at least five tracking samples, final position error below 3 mm, final joint error below 0.02 rad, final orientation error below 0.01 rad, and sampled maximum position tracking error below 15 mm. Cartesian acceptance additionally requires sampled geometric path deviation below 3 mm. A feedback timeout latches a fault and requires bringup to be restarted.</w:t>
       </w:r>
     </w:p>
     <w:p>
@@ -1144,39 +1143,39 @@
         <w:pStyle w:val="Heading1"/>
       </w:pPr>
       <w:r>
-        <w:t xml:space="preserve">8. 学生执行顺序</w:t>
-      </w:r>
-    </w:p>
-    <w:p>
-      <w:pPr>
-        <w:pStyle w:val="Normal"/>
-      </w:pPr>
-      <w:r>
-        <w:t xml:space="preserve"/>
-      </w:r>
-    </w:p>
-    <w:p>
-      <w:pPr>
-        <w:pStyle w:val="Normal"/>
-      </w:pPr>
-      <w:r>
-        <w:t xml:space="preserve">T0 构建与控制器激活 → T1 关节目标及反馈 → T2 FK/IK 与笛卡尔轨迹 → T3 topic、状态、取消 → T4 仿真与控制拆分、旧后端接入 → T5 编写应用适配器。</w:t>
-      </w:r>
-    </w:p>
-    <w:p>
-      <w:pPr>
-        <w:pStyle w:val="Normal"/>
-      </w:pPr>
-      <w:r>
-        <w:t xml:space="preserve"/>
-      </w:r>
-    </w:p>
-    <w:p>
-      <w:pPr>
-        <w:pStyle w:val="Normal"/>
-      </w:pPr>
-      <w:r>
-        <w:t xml:space="preserve">随后按 M1～M5 推进：M1 接入 llm_ros 和 sam3_ros，校验指令与分割结果；M2 对齐 RGB-D、恢复三维并标定相机到基座；M3 生成抓取候选，检查 TCP、IK、关节和碰撞约束；M4 用状态机串行执行接近、夹持、搬运与释放，并验证物理结果；M5 固定场景评估成功率、误差、延迟和失败原因。每阶段保存输入、配置、日志及结果，上一阶段验收后再接入下一阶段。</w:t>
+        <w:t xml:space="preserve">8. Student implementation sequence</w:t>
+      </w:r>
+    </w:p>
+    <w:p>
+      <w:pPr>
+        <w:pStyle w:val="Normal"/>
+      </w:pPr>
+      <w:r>
+        <w:t xml:space="preserve"/>
+      </w:r>
+    </w:p>
+    <w:p>
+      <w:pPr>
+        <w:pStyle w:val="Normal"/>
+      </w:pPr>
+      <w:r>
+        <w:t xml:space="preserve">T0 build and activate controllers; T1 joint targets and feedback; T2 FK/IK and Cartesian paths; T3 topics, status, and cancellation; T4 separate simulation/control and compare the existing backend; T5 implement the application adapter after validated coordinate and grasp outputs exist.</w:t>
+      </w:r>
+    </w:p>
+    <w:p>
+      <w:pPr>
+        <w:pStyle w:val="Normal"/>
+      </w:pPr>
+      <w:r>
+        <w:t xml:space="preserve"/>
+      </w:r>
+    </w:p>
+    <w:p>
+      <w:pPr>
+        <w:pStyle w:val="Normal"/>
+      </w:pPr>
+      <w:r>
+        <w:t xml:space="preserve">Application milestones follow in order. M1 connects llm_ros and sam3_ros and validates instructions and masks. M2 aligns RGB-D, reconstructs 3D points, and calibrates camera-to-base coordinates. M3 generates grasp candidates and checks TCP, IK, joint, collision, and gripper constraints. M4 serially approaches, grasps, transfers, releases, and verifies physical results. M5 freezes evaluation scenes and records success, error, latency, and failure causes. Retain inputs, configuration, logs, and results for each stage, and pass its review before connecting the next.</w:t>
       </w:r>
     </w:p>
     <w:p>
@@ -1192,23 +1191,39 @@
         <w:pStyle w:val="Heading1"/>
       </w:pPr>
       <w:r>
-        <w:t xml:space="preserve">9. 全英文桌面 UI</w:t>
-      </w:r>
-    </w:p>
-    <w:p>
-      <w:pPr>
-        <w:pStyle w:val="Normal"/>
-      </w:pPr>
-      <w:r>
-        <w:t xml:space="preserve"/>
-      </w:r>
-    </w:p>
-    <w:p>
-      <w:pPr>
-        <w:pStyle w:val="Normal"/>
-      </w:pPr>
-      <w:r>
-        <w:t xml:space="preserve">使用 ./scripts/run_workbench.sh --start 启动 Robot Workbench。左侧导入机器人 URDF 和末端 URDF/STL/OBJ，选择安装连杆，配置安装位置、角度、缩放及 TCP；Apply &amp; Reload 更新自己启动的仿真。中心显示真实仿真画面，下方提供关节/TCP 控制和 Robot Monitor。可以保存及重新打开 JSON 项目。View → Legacy Robot Monitor 可选择原有监控器与工作区，把实际 Qt6 窗口嵌入子模块。七轴兼容模型提供轨迹控制，其他轴数明确显示 Preview Only。末端以刚性器械装配，固定夹爪示例不含手指驱动。</w:t>
+        <w:t xml:space="preserve">9. English desktop workbench</w:t>
+      </w:r>
+    </w:p>
+    <w:p>
+      <w:pPr>
+        <w:pStyle w:val="Normal"/>
+      </w:pPr>
+      <w:r>
+        <w:t xml:space="preserve"/>
+      </w:r>
+    </w:p>
+    <w:p>
+      <w:pPr>
+        <w:pStyle w:val="Normal"/>
+      </w:pPr>
+      <w:r>
+        <w:t xml:space="preserve">Start Robot Workbench with ./scripts/run_workbench.sh --start. Import a robot URDF and an instrument URDF/STL/OBJ, select the mounting link, and configure translation, rotation, scale, and TCP. Apply &amp; Reload updates the simulator owned by the window. The centre shows live simulation; joint/TCP controls and Robot Monitor show motion and feedback. Save and reopen JSON projects.</w:t>
+      </w:r>
+    </w:p>
+    <w:p>
+      <w:pPr>
+        <w:pStyle w:val="Normal"/>
+      </w:pPr>
+      <w:r>
+        <w:t xml:space="preserve"/>
+      </w:r>
+    </w:p>
+    <w:p>
+      <w:pPr>
+        <w:pStyle w:val="Normal"/>
+      </w:pPr>
+      <w:r>
+        <w:t xml:space="preserve">View &gt; Legacy Robot Monitor selects the original monitor and workspace and embeds the actual Qt6 window on X11. Compatible seven-axis models support trajectory control; other supported joint counts display Preview Only. Instruments are rigid attachments, and the fixed gripper example has no finger actuator. The recorded workbench release includes 82 passing unit tests; see docs/validation.md for UI evidence.</w:t>
       </w:r>
     </w:p>
     <w:sectPr>
@@ -1227,7 +1242,9 @@
       <w:spacing w:after="90" w:line="280" w:lineRule="auto"/>
     </w:pPr>
     <w:rPr>
-      <w:rFonts w:ascii="Arial" w:hAnsi="Arial" w:eastAsia="Noto Sans CJK SC"/>
+      <w:rFonts w:ascii="Arial" w:hAnsi="Arial" w:eastAsia="Arial"/>
+      <w:lang w:val="en-GB"/>
+      <w:color w:val="000000"/>
       <w:sz w:val="22"/>
     </w:rPr>
   </w:style>
@@ -1239,7 +1256,9 @@
       <w:keepNext/>
     </w:pPr>
     <w:rPr>
-      <w:rFonts w:ascii="Arial" w:hAnsi="Arial" w:eastAsia="Noto Sans CJK SC"/>
+      <w:rFonts w:ascii="Arial" w:hAnsi="Arial" w:eastAsia="Arial"/>
+      <w:lang w:val="en-GB"/>
+      <w:color w:val="000000"/>
       <w:sz w:val="36"/>
       <w:b/>
     </w:rPr>
@@ -1252,7 +1271,9 @@
       <w:keepNext/>
     </w:pPr>
     <w:rPr>
-      <w:rFonts w:ascii="Arial" w:hAnsi="Arial" w:eastAsia="Noto Sans CJK SC"/>
+      <w:rFonts w:ascii="Arial" w:hAnsi="Arial" w:eastAsia="Arial"/>
+      <w:lang w:val="en-GB"/>
+      <w:color w:val="000000"/>
       <w:sz w:val="27"/>
       <w:b/>
     </w:rPr>
@@ -1264,7 +1285,9 @@
       <w:spacing w:after="0" w:line="280" w:lineRule="auto"/>
     </w:pPr>
     <w:rPr>
-      <w:rFonts w:ascii="Liberation Mono" w:hAnsi="Liberation Mono" w:eastAsia="Noto Sans CJK SC"/>
+      <w:rFonts w:ascii="Liberation Mono" w:hAnsi="Liberation Mono" w:eastAsia="Liberation Mono"/>
+      <w:lang w:val="en-GB"/>
+      <w:color w:val="000000"/>
       <w:sz w:val="17"/>
     </w:rPr>
   </w:style>

</xml_diff>